<commit_message>
Atualiza Visão 1 (modelo real da agêntica) e cria Visão 2 (demanda)
Visão 1: corrige a seção 3 do Status Geral para o modelo real da fábrica
agêntica (Programação Orientada a Contexto, papéis e componentes da stack,
gaps da revisão) — substitui o modelo antigo de 5 agentes.

Visão 2: dashboard para a ponta de demanda (GRT + gerentes sênior) com fluxo
em 5 passos, cadência de comunicação, regras, acompanhamento e glossário "no
bit" para treinamento. HTML + PDF.

https://claude.ai/code/session_01VN41cp61dZaxP723fGoe9F
</commit_message>
<xml_diff>
--- a/sysmap-fabric/status-geral-sysmap-fabric.docx
+++ b/sysmap-fabric/status-geral-sysmap-fabric.docx
@@ -12,7 +12,7 @@
           <w:color w:val="0F2342"/>
           <w:sz w:val="44"/>
         </w:rPr>
-        <w:t>SysMap Fabric — Status Geral da Fábrica</w:t>
+        <w:t>SysMap Fabric — Visão 1: Status Geral da Fábrica</w:t>
       </w:r>
     </w:p>
     <w:p>
@@ -51,7 +51,7 @@
           <w:i w:val="0"/>
           <w:sz w:val="20"/>
         </w:rPr>
-        <w:t>A SysMap Fabric organiza a operação Salesforce em duas dimensões complementares: a Fábrica Tradicional (entrega conduzida por pessoas — escopo fechado, evolutivos e AMS) e a Fábrica Agêntica (a mesma entrega aumentada por agentes de IA, prevista para Jul/2026). Ambas compartilham a mesma governança, o mesmo Jira e o mesmo CoE Salesforce.</w:t>
+        <w:t>A SysMap Fabric organiza a operação Salesforce em duas dimensões complementares: a Fábrica Tradicional (entrega conduzida por pessoas — escopo fechado, evolutivos e AMS) e a Fábrica Agêntica (a mesma entrega via Programação Orientada a Contexto — stack de MCPs/Skills que empodera pessoas). Ambas compartilham a mesma governança, o mesmo Jira e o mesmo CoE.</w:t>
       </w:r>
     </w:p>
     <w:tbl>
@@ -186,17 +186,15 @@
         <w:tc>
           <w:tcPr>
             <w:tcW w:type="dxa" w:w="6624"/>
-            <w:shd w:val="clear" w:fill="FEF3C7"/>
           </w:tcPr>
           <w:p>
             <w:r/>
             <w:r>
               <w:rPr>
                 <w:b w:val="0"/>
-                <w:color w:val="B45309"/>
                 <w:sz w:val="18"/>
               </w:rPr>
-              <w:t>A iniciar — roadmap Jul/2026 · 5 agentes definidos, sem spec ainda</w:t>
+              <w:t>Protótipo existe (app de fluxo) — stack a estruturar; decisões fundadoras em aberto</w:t>
             </w:r>
           </w:p>
         </w:tc>
@@ -963,7 +961,18 @@
           <w:i w:val="0"/>
           <w:sz w:val="20"/>
         </w:rPr>
-        <w:t>A Fábrica Agêntica incorpora agentes de IA ao fluxo de entrega (Demand → Setup → Dev → QA → AIOps), supervisionados por pessoas. É uma modalidade do CoE liderada por Ana Lima (CTO &amp; IA) com apoio do Especialista Agêntico. Stack prevista: Claude API + Cursor. Início planejado: Jul/2026.</w:t>
+        <w:t>Modelo: Programação Orientada a Contexto com implementação em linguagem natural. Não são "agentes autônomos" — é uma stack agêntica (Cursor + MCPs/Skills + Context Loader + Knowledge Base) que empodera pessoas. Fluxo Jira-cêntrico: o Engenheiro AI seleciona o card, o Context Loader monta o contexto, implementa no Cursor, comita no Git e atualiza o card. Já existe um protótipo (app de fluxo); o objetivo agora é estruturar para escalar.</w:t>
+      </w:r>
+    </w:p>
+    <w:p>
+      <w:r>
+        <w:rPr>
+          <w:b/>
+          <w:i w:val="0"/>
+          <w:color w:val="0F2342"/>
+          <w:sz w:val="20"/>
+        </w:rPr>
+        <w:t>Papéis (organograma):</w:t>
       </w:r>
     </w:p>
     <w:tbl>
@@ -974,15 +983,14 @@
         <w:tblLook w:firstColumn="1" w:firstRow="1" w:lastColumn="0" w:lastRow="0" w:noHBand="0" w:noVBand="1" w:val="04A0"/>
       </w:tblPr>
       <w:tblGrid>
-        <w:gridCol w:w="2484"/>
-        <w:gridCol w:w="2484"/>
-        <w:gridCol w:w="2484"/>
-        <w:gridCol w:w="2484"/>
+        <w:gridCol w:w="3312"/>
+        <w:gridCol w:w="3312"/>
+        <w:gridCol w:w="3312"/>
       </w:tblGrid>
       <w:tr>
         <w:tc>
           <w:tcPr>
-            <w:tcW w:type="dxa" w:w="2016"/>
+            <w:tcW w:type="dxa" w:w="2736"/>
             <w:shd w:val="clear" w:fill="1D4ED8"/>
           </w:tcPr>
           <w:p>
@@ -993,13 +1001,13 @@
                 <w:color w:val="FFFFFF"/>
                 <w:sz w:val="18"/>
               </w:rPr>
-              <w:t>Agente</w:t>
+              <w:t>Papel</w:t>
             </w:r>
           </w:p>
         </w:tc>
         <w:tc>
           <w:tcPr>
-            <w:tcW w:type="dxa" w:w="4608"/>
+            <w:tcW w:type="dxa" w:w="5328"/>
             <w:shd w:val="clear" w:fill="1D4ED8"/>
           </w:tcPr>
           <w:p>
@@ -1010,7 +1018,7 @@
                 <w:color w:val="FFFFFF"/>
                 <w:sz w:val="18"/>
               </w:rPr>
-              <w:t>Função no fluxo</w:t>
+              <w:t>Responsabilidade</w:t>
             </w:r>
           </w:p>
         </w:tc>
@@ -1031,28 +1039,11 @@
             </w:r>
           </w:p>
         </w:tc>
-        <w:tc>
-          <w:tcPr>
-            <w:tcW w:type="dxa" w:w="1440"/>
-            <w:shd w:val="clear" w:fill="1D4ED8"/>
-          </w:tcPr>
-          <w:p>
-            <w:r/>
-            <w:r>
-              <w:rPr>
-                <w:b/>
-                <w:color w:val="FFFFFF"/>
-                <w:sz w:val="18"/>
-              </w:rPr>
-              <w:t>Dependência</w:t>
-            </w:r>
-          </w:p>
-        </w:tc>
       </w:tr>
       <w:tr>
         <w:tc>
           <w:tcPr>
-            <w:tcW w:type="dxa" w:w="2016"/>
+            <w:tcW w:type="dxa" w:w="2736"/>
           </w:tcPr>
           <w:p>
             <w:r/>
@@ -1061,13 +1052,13 @@
                 <w:b w:val="0"/>
                 <w:sz w:val="18"/>
               </w:rPr>
-              <w:t>Demand Agent</w:t>
+              <w:t>Gerente de Delivery da F. Agêntica</w:t>
             </w:r>
           </w:p>
         </w:tc>
         <w:tc>
           <w:tcPr>
-            <w:tcW w:type="dxa" w:w="4608"/>
+            <w:tcW w:type="dxa" w:w="5328"/>
           </w:tcPr>
           <w:p>
             <w:r/>
@@ -1076,7 +1067,7 @@
                 <w:b w:val="0"/>
                 <w:sz w:val="18"/>
               </w:rPr>
-              <w:t>Intake, triagem e estruturação de demandas (F1)</w:t>
+              <w:t>Performance global, evolução da stack, governança, conteúdo dos Engenheiros AI</w:t>
             </w:r>
           </w:p>
         </w:tc>
@@ -1093,13 +1084,15 @@
                 <w:color w:val="B45309"/>
                 <w:sz w:val="18"/>
               </w:rPr>
-              <w:t>⚠ A iniciar (Jul/26)</w:t>
+              <w:t>⚠ Definir titular</w:t>
             </w:r>
           </w:p>
         </w:tc>
+      </w:tr>
+      <w:tr>
         <w:tc>
           <w:tcPr>
-            <w:tcW w:type="dxa" w:w="1440"/>
+            <w:tcW w:type="dxa" w:w="2736"/>
           </w:tcPr>
           <w:p>
             <w:r/>
@@ -1108,15 +1101,13 @@
                 <w:b w:val="0"/>
                 <w:sz w:val="18"/>
               </w:rPr>
-              <w:t>Spec do agente</w:t>
+              <w:t>CoE</w:t>
             </w:r>
           </w:p>
         </w:tc>
-      </w:tr>
-      <w:tr>
         <w:tc>
           <w:tcPr>
-            <w:tcW w:type="dxa" w:w="2016"/>
+            <w:tcW w:type="dxa" w:w="5328"/>
           </w:tcPr>
           <w:p>
             <w:r/>
@@ -1125,22 +1116,7 @@
                 <w:b w:val="0"/>
                 <w:sz w:val="18"/>
               </w:rPr>
-              <w:t>Setup Agent</w:t>
-            </w:r>
-          </w:p>
-        </w:tc>
-        <w:tc>
-          <w:tcPr>
-            <w:tcW w:type="dxa" w:w="4608"/>
-          </w:tcPr>
-          <w:p>
-            <w:r/>
-            <w:r>
-              <w:rPr>
-                <w:b w:val="0"/>
-                <w:sz w:val="18"/>
-              </w:rPr>
-              <w:t>Provisionamento de ambiente e scaffolding (F2)</w:t>
+              <w:t>Constrói MCPs/Skills, Context Loader, Knowledge Base, templates e bootcamp</w:t>
             </w:r>
           </w:p>
         </w:tc>
@@ -1157,13 +1133,15 @@
                 <w:color w:val="B45309"/>
                 <w:sz w:val="18"/>
               </w:rPr>
-              <w:t>⚠ A iniciar (Jul/26)</w:t>
+              <w:t>🟡 Em estruturação</w:t>
             </w:r>
           </w:p>
         </w:tc>
+      </w:tr>
+      <w:tr>
         <w:tc>
           <w:tcPr>
-            <w:tcW w:type="dxa" w:w="1440"/>
+            <w:tcW w:type="dxa" w:w="2736"/>
           </w:tcPr>
           <w:p>
             <w:r/>
@@ -1172,15 +1150,13 @@
                 <w:b w:val="0"/>
                 <w:sz w:val="18"/>
               </w:rPr>
-              <w:t>Spec do agente</w:t>
+              <w:t>Champion AI (Arquiteto de Contexto)</w:t>
             </w:r>
           </w:p>
         </w:tc>
-      </w:tr>
-      <w:tr>
         <w:tc>
           <w:tcPr>
-            <w:tcW w:type="dxa" w:w="2016"/>
+            <w:tcW w:type="dxa" w:w="5328"/>
           </w:tcPr>
           <w:p>
             <w:r/>
@@ -1189,22 +1165,7 @@
                 <w:b w:val="0"/>
                 <w:sz w:val="18"/>
               </w:rPr>
-              <w:t>Dev Agent</w:t>
-            </w:r>
-          </w:p>
-        </w:tc>
-        <w:tc>
-          <w:tcPr>
-            <w:tcW w:type="dxa" w:w="4608"/>
-          </w:tcPr>
-          <w:p>
-            <w:r/>
-            <w:r>
-              <w:rPr>
-                <w:b w:val="0"/>
-                <w:sz w:val="18"/>
-              </w:rPr>
-              <w:t>Apoio a Apex/LWC/Flow sob supervisão (F3)</w:t>
+              <w:t>Cria o contexto (cliente/programa/jornada), granularidade, 'cola' estratégia↔execução</w:t>
             </w:r>
           </w:p>
         </w:tc>
@@ -1221,13 +1182,15 @@
                 <w:color w:val="B45309"/>
                 <w:sz w:val="18"/>
               </w:rPr>
-              <w:t>⚠ A iniciar (Jul/26)</w:t>
+              <w:t>⚠ Definir titular</w:t>
             </w:r>
           </w:p>
         </w:tc>
+      </w:tr>
+      <w:tr>
         <w:tc>
           <w:tcPr>
-            <w:tcW w:type="dxa" w:w="1440"/>
+            <w:tcW w:type="dxa" w:w="2736"/>
           </w:tcPr>
           <w:p>
             <w:r/>
@@ -1236,15 +1199,13 @@
                 <w:b w:val="0"/>
                 <w:sz w:val="18"/>
               </w:rPr>
-              <w:t>Spec + quality gates</w:t>
+              <w:t>Engenheiros AI</w:t>
             </w:r>
           </w:p>
         </w:tc>
-      </w:tr>
-      <w:tr>
         <w:tc>
           <w:tcPr>
-            <w:tcW w:type="dxa" w:w="2016"/>
+            <w:tcW w:type="dxa" w:w="5328"/>
           </w:tcPr>
           <w:p>
             <w:r/>
@@ -1253,22 +1214,7 @@
                 <w:b w:val="0"/>
                 <w:sz w:val="18"/>
               </w:rPr>
-              <w:t>QA Agent</w:t>
-            </w:r>
-          </w:p>
-        </w:tc>
-        <w:tc>
-          <w:tcPr>
-            <w:tcW w:type="dxa" w:w="4608"/>
-          </w:tcPr>
-          <w:p>
-            <w:r/>
-            <w:r>
-              <w:rPr>
-                <w:b w:val="0"/>
-                <w:sz w:val="18"/>
-              </w:rPr>
-              <w:t>Geração de cenários G/W/T e testes (F4)</w:t>
+              <w:t>Executam com contexto pré-carregado, usam MCPs/Skills, comitam e atualizam o Jira</w:t>
             </w:r>
           </w:p>
         </w:tc>
@@ -1285,13 +1231,15 @@
                 <w:color w:val="B45309"/>
                 <w:sz w:val="18"/>
               </w:rPr>
-              <w:t>⚠ A iniciar (Jul/26)</w:t>
+              <w:t>⚠ Bootcamp a iniciar</w:t>
             </w:r>
           </w:p>
         </w:tc>
+      </w:tr>
+      <w:tr>
         <w:tc>
           <w:tcPr>
-            <w:tcW w:type="dxa" w:w="1440"/>
+            <w:tcW w:type="dxa" w:w="2736"/>
           </w:tcPr>
           <w:p>
             <w:r/>
@@ -1300,15 +1248,13 @@
                 <w:b w:val="0"/>
                 <w:sz w:val="18"/>
               </w:rPr>
-              <w:t>Spec do agente</w:t>
+              <w:t>Líder de FSW AI</w:t>
             </w:r>
           </w:p>
         </w:tc>
-      </w:tr>
-      <w:tr>
         <w:tc>
           <w:tcPr>
-            <w:tcW w:type="dxa" w:w="2016"/>
+            <w:tcW w:type="dxa" w:w="5328"/>
           </w:tcPr>
           <w:p>
             <w:r/>
@@ -1317,22 +1263,7 @@
                 <w:b w:val="0"/>
                 <w:sz w:val="18"/>
               </w:rPr>
-              <w:t>AIOps Agent</w:t>
-            </w:r>
-          </w:p>
-        </w:tc>
-        <w:tc>
-          <w:tcPr>
-            <w:tcW w:type="dxa" w:w="4608"/>
-          </w:tcPr>
-          <w:p>
-            <w:r/>
-            <w:r>
-              <w:rPr>
-                <w:b w:val="0"/>
-                <w:sz w:val="18"/>
-              </w:rPr>
-              <w:t>Monitoramento e operação pós go-live (F5)</w:t>
+              <w:t>Fluxo de trabalho, sincronização Jira↔Git↔execução, ritos, histórias context-ready</w:t>
             </w:r>
           </w:p>
         </w:tc>
@@ -1349,13 +1280,92 @@
                 <w:color w:val="B45309"/>
                 <w:sz w:val="18"/>
               </w:rPr>
-              <w:t>⚠ A iniciar (Jul/26)</w:t>
+              <w:t>⚠ Definir titular</w:t>
+            </w:r>
+          </w:p>
+        </w:tc>
+      </w:tr>
+    </w:tbl>
+    <w:p>
+      <w:r>
+        <w:rPr>
+          <w:b/>
+          <w:i w:val="0"/>
+          <w:color w:val="0F2342"/>
+          <w:sz w:val="20"/>
+        </w:rPr>
+        <w:t>Componentes da stack:</w:t>
+      </w:r>
+    </w:p>
+    <w:tbl>
+      <w:tblPr>
+        <w:tblStyle w:val="TableGrid"/>
+        <w:tblW w:type="auto" w:w="0"/>
+        <w:jc w:val="center"/>
+        <w:tblLook w:firstColumn="1" w:firstRow="1" w:lastColumn="0" w:lastRow="0" w:noHBand="0" w:noVBand="1" w:val="04A0"/>
+      </w:tblPr>
+      <w:tblGrid>
+        <w:gridCol w:w="3312"/>
+        <w:gridCol w:w="3312"/>
+        <w:gridCol w:w="3312"/>
+      </w:tblGrid>
+      <w:tr>
+        <w:tc>
+          <w:tcPr>
+            <w:tcW w:type="dxa" w:w="2736"/>
+            <w:shd w:val="clear" w:fill="1D4ED8"/>
+          </w:tcPr>
+          <w:p>
+            <w:r/>
+            <w:r>
+              <w:rPr>
+                <w:b/>
+                <w:color w:val="FFFFFF"/>
+                <w:sz w:val="18"/>
+              </w:rPr>
+              <w:t>Componente</w:t>
             </w:r>
           </w:p>
         </w:tc>
         <w:tc>
           <w:tcPr>
-            <w:tcW w:type="dxa" w:w="1440"/>
+            <w:tcW w:type="dxa" w:w="5328"/>
+            <w:shd w:val="clear" w:fill="1D4ED8"/>
+          </w:tcPr>
+          <w:p>
+            <w:r/>
+            <w:r>
+              <w:rPr>
+                <w:b/>
+                <w:color w:val="FFFFFF"/>
+                <w:sz w:val="18"/>
+              </w:rPr>
+              <w:t>O que é</w:t>
+            </w:r>
+          </w:p>
+        </w:tc>
+        <w:tc>
+          <w:tcPr>
+            <w:tcW w:type="dxa" w:w="2016"/>
+            <w:shd w:val="clear" w:fill="1D4ED8"/>
+          </w:tcPr>
+          <w:p>
+            <w:r/>
+            <w:r>
+              <w:rPr>
+                <w:b/>
+                <w:color w:val="FFFFFF"/>
+                <w:sz w:val="18"/>
+              </w:rPr>
+              <w:t>Status</w:t>
+            </w:r>
+          </w:p>
+        </w:tc>
+      </w:tr>
+      <w:tr>
+        <w:tc>
+          <w:tcPr>
+            <w:tcW w:type="dxa" w:w="2736"/>
           </w:tcPr>
           <w:p>
             <w:r/>
@@ -1364,7 +1374,333 @@
                 <w:b w:val="0"/>
                 <w:sz w:val="18"/>
               </w:rPr>
-              <w:t>Spec + Event Monitoring</w:t>
+              <w:t>MCP/Skill Contexto</w:t>
+            </w:r>
+          </w:p>
+        </w:tc>
+        <w:tc>
+          <w:tcPr>
+            <w:tcW w:type="dxa" w:w="5328"/>
+          </w:tcPr>
+          <w:p>
+            <w:r/>
+            <w:r>
+              <w:rPr>
+                <w:b w:val="0"/>
+                <w:sz w:val="18"/>
+              </w:rPr>
+              <w:t>Docs de negócio e técnicos</w:t>
+            </w:r>
+          </w:p>
+        </w:tc>
+        <w:tc>
+          <w:tcPr>
+            <w:tcW w:type="dxa" w:w="2016"/>
+            <w:shd w:val="clear" w:fill="FEF3C7"/>
+          </w:tcPr>
+          <w:p>
+            <w:r/>
+            <w:r>
+              <w:rPr>
+                <w:b w:val="0"/>
+                <w:color w:val="B45309"/>
+                <w:sz w:val="18"/>
+              </w:rPr>
+              <w:t>⚠ A construir</w:t>
+            </w:r>
+          </w:p>
+        </w:tc>
+      </w:tr>
+      <w:tr>
+        <w:tc>
+          <w:tcPr>
+            <w:tcW w:type="dxa" w:w="2736"/>
+          </w:tcPr>
+          <w:p>
+            <w:r/>
+            <w:r>
+              <w:rPr>
+                <w:b w:val="0"/>
+                <w:sz w:val="18"/>
+              </w:rPr>
+              <w:t>MCP/Skill Engenharia</w:t>
+            </w:r>
+          </w:p>
+        </w:tc>
+        <w:tc>
+          <w:tcPr>
+            <w:tcW w:type="dxa" w:w="5328"/>
+          </w:tcPr>
+          <w:p>
+            <w:r/>
+            <w:r>
+              <w:rPr>
+                <w:b w:val="0"/>
+                <w:sz w:val="18"/>
+              </w:rPr>
+              <w:t>Templates, geração de serviços, Backstage, Git</w:t>
+            </w:r>
+          </w:p>
+        </w:tc>
+        <w:tc>
+          <w:tcPr>
+            <w:tcW w:type="dxa" w:w="2016"/>
+            <w:shd w:val="clear" w:fill="FEF3C7"/>
+          </w:tcPr>
+          <w:p>
+            <w:r/>
+            <w:r>
+              <w:rPr>
+                <w:b w:val="0"/>
+                <w:color w:val="B45309"/>
+                <w:sz w:val="18"/>
+              </w:rPr>
+              <w:t>⚠ A construir</w:t>
+            </w:r>
+          </w:p>
+        </w:tc>
+      </w:tr>
+      <w:tr>
+        <w:tc>
+          <w:tcPr>
+            <w:tcW w:type="dxa" w:w="2736"/>
+          </w:tcPr>
+          <w:p>
+            <w:r/>
+            <w:r>
+              <w:rPr>
+                <w:b w:val="0"/>
+                <w:sz w:val="18"/>
+              </w:rPr>
+              <w:t>MCP/Skill Governança</w:t>
+            </w:r>
+          </w:p>
+        </w:tc>
+        <w:tc>
+          <w:tcPr>
+            <w:tcW w:type="dxa" w:w="5328"/>
+          </w:tcPr>
+          <w:p>
+            <w:r/>
+            <w:r>
+              <w:rPr>
+                <w:b w:val="0"/>
+                <w:sz w:val="18"/>
+              </w:rPr>
+              <w:t>Pipeline DevSecOps, quality gate, design patterns</w:t>
+            </w:r>
+          </w:p>
+        </w:tc>
+        <w:tc>
+          <w:tcPr>
+            <w:tcW w:type="dxa" w:w="2016"/>
+            <w:shd w:val="clear" w:fill="FEF3C7"/>
+          </w:tcPr>
+          <w:p>
+            <w:r/>
+            <w:r>
+              <w:rPr>
+                <w:b w:val="0"/>
+                <w:color w:val="B45309"/>
+                <w:sz w:val="18"/>
+              </w:rPr>
+              <w:t>⚠ A construir</w:t>
+            </w:r>
+          </w:p>
+        </w:tc>
+      </w:tr>
+      <w:tr>
+        <w:tc>
+          <w:tcPr>
+            <w:tcW w:type="dxa" w:w="2736"/>
+          </w:tcPr>
+          <w:p>
+            <w:r/>
+            <w:r>
+              <w:rPr>
+                <w:b w:val="0"/>
+                <w:sz w:val="18"/>
+              </w:rPr>
+              <w:t>Context Loader</w:t>
+            </w:r>
+          </w:p>
+        </w:tc>
+        <w:tc>
+          <w:tcPr>
+            <w:tcW w:type="dxa" w:w="5328"/>
+          </w:tcPr>
+          <w:p>
+            <w:r/>
+            <w:r>
+              <w:rPr>
+                <w:b w:val="0"/>
+                <w:sz w:val="18"/>
+              </w:rPr>
+              <w:t>Monta o contexto do card (repo + KB + ticket) — componente-chave</w:t>
+            </w:r>
+          </w:p>
+        </w:tc>
+        <w:tc>
+          <w:tcPr>
+            <w:tcW w:type="dxa" w:w="2016"/>
+            <w:shd w:val="clear" w:fill="FEF3C7"/>
+          </w:tcPr>
+          <w:p>
+            <w:r/>
+            <w:r>
+              <w:rPr>
+                <w:b w:val="0"/>
+                <w:color w:val="B45309"/>
+                <w:sz w:val="18"/>
+              </w:rPr>
+              <w:t>⚠ Sem spec</w:t>
+            </w:r>
+          </w:p>
+        </w:tc>
+      </w:tr>
+      <w:tr>
+        <w:tc>
+          <w:tcPr>
+            <w:tcW w:type="dxa" w:w="2736"/>
+          </w:tcPr>
+          <w:p>
+            <w:r/>
+            <w:r>
+              <w:rPr>
+                <w:b w:val="0"/>
+                <w:sz w:val="18"/>
+              </w:rPr>
+              <w:t>Knowledge Base Arquitetural</w:t>
+            </w:r>
+          </w:p>
+        </w:tc>
+        <w:tc>
+          <w:tcPr>
+            <w:tcW w:type="dxa" w:w="5328"/>
+          </w:tcPr>
+          <w:p>
+            <w:r/>
+            <w:r>
+              <w:rPr>
+                <w:b w:val="0"/>
+                <w:sz w:val="18"/>
+              </w:rPr>
+              <w:t>Padrões (microserviços, EDA, BFF, segurança), guidelines, templates</w:t>
+            </w:r>
+          </w:p>
+        </w:tc>
+        <w:tc>
+          <w:tcPr>
+            <w:tcW w:type="dxa" w:w="2016"/>
+            <w:shd w:val="clear" w:fill="FEF3C7"/>
+          </w:tcPr>
+          <w:p>
+            <w:r/>
+            <w:r>
+              <w:rPr>
+                <w:b w:val="0"/>
+                <w:color w:val="B45309"/>
+                <w:sz w:val="18"/>
+              </w:rPr>
+              <w:t>⚠ A estruturar</w:t>
+            </w:r>
+          </w:p>
+        </w:tc>
+      </w:tr>
+      <w:tr>
+        <w:tc>
+          <w:tcPr>
+            <w:tcW w:type="dxa" w:w="2736"/>
+          </w:tcPr>
+          <w:p>
+            <w:r/>
+            <w:r>
+              <w:rPr>
+                <w:b w:val="0"/>
+                <w:sz w:val="18"/>
+              </w:rPr>
+              <w:t>Stack de execução</w:t>
+            </w:r>
+          </w:p>
+        </w:tc>
+        <w:tc>
+          <w:tcPr>
+            <w:tcW w:type="dxa" w:w="5328"/>
+          </w:tcPr>
+          <w:p>
+            <w:r/>
+            <w:r>
+              <w:rPr>
+                <w:b w:val="0"/>
+                <w:sz w:val="18"/>
+              </w:rPr>
+              <w:t>Cursor + Git + Supabase + Event Broker (Kafka/NATS) + pipeline</w:t>
+            </w:r>
+          </w:p>
+        </w:tc>
+        <w:tc>
+          <w:tcPr>
+            <w:tcW w:type="dxa" w:w="2016"/>
+            <w:shd w:val="clear" w:fill="FEF3C7"/>
+          </w:tcPr>
+          <w:p>
+            <w:r/>
+            <w:r>
+              <w:rPr>
+                <w:b w:val="0"/>
+                <w:color w:val="B45309"/>
+                <w:sz w:val="18"/>
+              </w:rPr>
+              <w:t>🟡 Protótipo</w:t>
+            </w:r>
+          </w:p>
+        </w:tc>
+      </w:tr>
+      <w:tr>
+        <w:tc>
+          <w:tcPr>
+            <w:tcW w:type="dxa" w:w="2736"/>
+          </w:tcPr>
+          <w:p>
+            <w:r/>
+            <w:r>
+              <w:rPr>
+                <w:b w:val="0"/>
+                <w:sz w:val="18"/>
+              </w:rPr>
+              <w:t>Telemetria / Dashboards</w:t>
+            </w:r>
+          </w:p>
+        </w:tc>
+        <w:tc>
+          <w:tcPr>
+            <w:tcW w:type="dxa" w:w="5328"/>
+          </w:tcPr>
+          <w:p>
+            <w:r/>
+            <w:r>
+              <w:rPr>
+                <w:b w:val="0"/>
+                <w:sz w:val="18"/>
+              </w:rPr>
+              <w:t>Uso de MCP/Skills, produtividade, aderência, lead time, defeitos</w:t>
+            </w:r>
+          </w:p>
+        </w:tc>
+        <w:tc>
+          <w:tcPr>
+            <w:tcW w:type="dxa" w:w="2016"/>
+            <w:shd w:val="clear" w:fill="FEF3C7"/>
+          </w:tcPr>
+          <w:p>
+            <w:r/>
+            <w:r>
+              <w:rPr>
+                <w:b w:val="0"/>
+                <w:color w:val="B45309"/>
+                <w:sz w:val="18"/>
+              </w:rPr>
+              <w:t>⚠ A definir</w:t>
             </w:r>
           </w:p>
         </w:tc>
@@ -1378,7 +1714,7 @@
           <w:color w:val="B45309"/>
           <w:sz w:val="20"/>
         </w:rPr>
-        <w:t>O que ainda precisa ser feito na fábrica agêntica (gaps):</w:t>
+        <w:t>Gaps a estruturar (da revisão crítica):</w:t>
       </w:r>
     </w:p>
     <w:p>
@@ -1389,7 +1725,7 @@
         <w:rPr>
           <w:sz w:val="18"/>
         </w:rPr>
-        <w:t>Spec técnica de cada agente: entradas, saídas, prompts, guard-rails e ponto de supervisão humana.</w:t>
+        <w:t>Decisões fundadoras: entrega SF/custom/ambos · Engenheiro = pessoa ou agente · gates humanos · reuso da governança tradicional.</w:t>
       </w:r>
     </w:p>
     <w:p>
@@ -1400,7 +1736,7 @@
         <w:rPr>
           <w:sz w:val="18"/>
         </w:rPr>
-        <w:t>Definir o Especialista Agêntico (papel previsto, ainda não alocado).</w:t>
+        <w:t>Spec do Context Loader (o que carrega, de onde, orçamento de tokens, frescor) — hoje é caixa-preta.</w:t>
       </w:r>
     </w:p>
     <w:p>
@@ -1411,7 +1747,7 @@
         <w:rPr>
           <w:sz w:val="18"/>
         </w:rPr>
-        <w:t>Definir como os agentes se integram ao Jira v1.2 (que campos leem/escrevem, em quais transições).</w:t>
+        <w:t>Catálogo de MCPs/Skills com dono, versão e entradas/saídas — o ativo central ainda não existe.</w:t>
       </w:r>
     </w:p>
     <w:p>
@@ -1422,7 +1758,7 @@
         <w:rPr>
           <w:sz w:val="18"/>
         </w:rPr>
-        <w:t>KPIs de adoção dos agentes — o dashboard de diretoria já reserva o visual 'Saúde da fábrica agêntica'.</w:t>
+        <w:t>Camada de qualidade/verificação do código gerado por IA (testes, revisão, gate antes de auto-update do Jira).</w:t>
       </w:r>
     </w:p>
     <w:p>
@@ -1433,7 +1769,29 @@
         <w:rPr>
           <w:sz w:val="18"/>
         </w:rPr>
-        <w:t>Política de uso de IA, dados do cliente e LGPD no fluxo agêntico.</w:t>
+        <w:t>DoR de contexto: o que torna uma história 'context-ready' antes de executar.</w:t>
+      </w:r>
+    </w:p>
+    <w:p>
+      <w:pPr>
+        <w:pStyle w:val="ListBullet"/>
+      </w:pPr>
+      <w:r>
+        <w:rPr>
+          <w:sz w:val="18"/>
+        </w:rPr>
+        <w:t>Segurança/LGPD do contexto (dados de cliente no prompt, prompt injection) e FinOps (custo/história, guardrails).</w:t>
+      </w:r>
+    </w:p>
+    <w:p>
+      <w:pPr>
+        <w:pStyle w:val="ListBullet"/>
+      </w:pPr>
+      <w:r>
+        <w:rPr>
+          <w:sz w:val="18"/>
+        </w:rPr>
+        <w:t>Mapeamento ao ciclo F0–F5: a stack cobre F2–F4; falta onde vivem F0/F1 e F5.</w:t>
       </w:r>
     </w:p>
     <w:p>

</xml_diff>

<commit_message>
Aplica decisões da Ana: spec Jira v1.3 + atualiza status e backlog
Spec v1.3: swimlanes voltam a 2 (Upstream/Downstream); instância não-Cloud
(Espaço por cliente); campos nativos primeiro; financeiro só no Power BI com
SSG ID como chave; Fase da Fábrica deixa de ser campo; overhead 10% fixo;
Project Key SSG+5 dígitos; throughput por boas práticas; alertas com SLA.

Status Geral (Visão 1): fábrica agêntica com foco Salesforce + tabela
consolidada de pontos de atenção/aberto. Backlog e status de produção
atualizados para refletir as decisões; pasta template por tipo de projeto
adicionada ao board e ao backlog.

https://claude.ai/code/session_01VN41cp61dZaxP723fGoe9F
</commit_message>
<xml_diff>
--- a/sysmap-fabric/status-geral-sysmap-fabric.docx
+++ b/sysmap-fabric/status-geral-sysmap-fabric.docx
@@ -194,7 +194,7 @@
                 <w:b w:val="0"/>
                 <w:sz w:val="18"/>
               </w:rPr>
-              <w:t>Protótipo existe (app de fluxo) — stack a estruturar; decisões fundadoras em aberto</w:t>
+              <w:t>Foco Salesforce · protótipo existe (app de fluxo) — stack a estruturar</w:t>
             </w:r>
           </w:p>
         </w:tc>
@@ -961,7 +961,7 @@
           <w:i w:val="0"/>
           <w:sz w:val="20"/>
         </w:rPr>
-        <w:t>Modelo: Programação Orientada a Contexto com implementação em linguagem natural. Não são "agentes autônomos" — é uma stack agêntica (Cursor + MCPs/Skills + Context Loader + Knowledge Base) que empodera pessoas. Fluxo Jira-cêntrico: o Engenheiro AI seleciona o card, o Context Loader monta o contexto, implementa no Cursor, comita no Git e atualiza o card. Já existe um protótipo (app de fluxo); o objetivo agora é estruturar para escalar.</w:t>
+        <w:t>Modelo: Programação Orientada a Contexto com implementação em linguagem natural. Não são "agentes autônomos" — é uma stack agêntica (Cursor + MCPs/Skills + Context Loader + Knowledge Base) que empodera pessoas. Fluxo Jira-cêntrico: o Engenheiro AI seleciona o card, o Context Loader monta o contexto, implementa no Cursor, comita no Git e atualiza o card. Já existe um protótipo (app de fluxo); o objetivo agora é estruturar para escalar. Foco: Salesforce — a stack atende SF e software custom (cloud-native), mas a prioridade é Salesforce.</w:t>
       </w:r>
     </w:p>
     <w:p>
@@ -1714,86 +1714,651 @@
           <w:color w:val="B45309"/>
           <w:sz w:val="20"/>
         </w:rPr>
-        <w:t>Gaps a estruturar (da revisão crítica):</w:t>
+        <w:t>Pontos de atenção e em aberto (consolidado):</w:t>
       </w:r>
     </w:p>
-    <w:p>
-      <w:pPr>
-        <w:pStyle w:val="ListBullet"/>
-      </w:pPr>
-      <w:r>
-        <w:rPr>
-          <w:sz w:val="18"/>
-        </w:rPr>
-        <w:t>Decisões fundadoras: entrega SF/custom/ambos · Engenheiro = pessoa ou agente · gates humanos · reuso da governança tradicional.</w:t>
-      </w:r>
-    </w:p>
-    <w:p>
-      <w:pPr>
-        <w:pStyle w:val="ListBullet"/>
-      </w:pPr>
-      <w:r>
-        <w:rPr>
-          <w:sz w:val="18"/>
-        </w:rPr>
-        <w:t>Spec do Context Loader (o que carrega, de onde, orçamento de tokens, frescor) — hoje é caixa-preta.</w:t>
-      </w:r>
-    </w:p>
-    <w:p>
-      <w:pPr>
-        <w:pStyle w:val="ListBullet"/>
-      </w:pPr>
-      <w:r>
-        <w:rPr>
-          <w:sz w:val="18"/>
-        </w:rPr>
-        <w:t>Catálogo de MCPs/Skills com dono, versão e entradas/saídas — o ativo central ainda não existe.</w:t>
-      </w:r>
-    </w:p>
-    <w:p>
-      <w:pPr>
-        <w:pStyle w:val="ListBullet"/>
-      </w:pPr>
-      <w:r>
-        <w:rPr>
-          <w:sz w:val="18"/>
-        </w:rPr>
-        <w:t>Camada de qualidade/verificação do código gerado por IA (testes, revisão, gate antes de auto-update do Jira).</w:t>
-      </w:r>
-    </w:p>
-    <w:p>
-      <w:pPr>
-        <w:pStyle w:val="ListBullet"/>
-      </w:pPr>
-      <w:r>
-        <w:rPr>
-          <w:sz w:val="18"/>
-        </w:rPr>
-        <w:t>DoR de contexto: o que torna uma história 'context-ready' antes de executar.</w:t>
-      </w:r>
-    </w:p>
-    <w:p>
-      <w:pPr>
-        <w:pStyle w:val="ListBullet"/>
-      </w:pPr>
-      <w:r>
-        <w:rPr>
-          <w:sz w:val="18"/>
-        </w:rPr>
-        <w:t>Segurança/LGPD do contexto (dados de cliente no prompt, prompt injection) e FinOps (custo/história, guardrails).</w:t>
-      </w:r>
-    </w:p>
-    <w:p>
-      <w:pPr>
-        <w:pStyle w:val="ListBullet"/>
-      </w:pPr>
-      <w:r>
-        <w:rPr>
-          <w:sz w:val="18"/>
-        </w:rPr>
-        <w:t>Mapeamento ao ciclo F0–F5: a stack cobre F2–F4; falta onde vivem F0/F1 e F5.</w:t>
-      </w:r>
-    </w:p>
+    <w:tbl>
+      <w:tblPr>
+        <w:tblStyle w:val="TableGrid"/>
+        <w:tblW w:type="auto" w:w="0"/>
+        <w:jc w:val="center"/>
+        <w:tblLook w:firstColumn="1" w:firstRow="1" w:lastColumn="0" w:lastRow="0" w:noHBand="0" w:noVBand="1" w:val="04A0"/>
+      </w:tblPr>
+      <w:tblGrid>
+        <w:gridCol w:w="3312"/>
+        <w:gridCol w:w="3312"/>
+        <w:gridCol w:w="3312"/>
+      </w:tblGrid>
+      <w:tr>
+        <w:tc>
+          <w:tcPr>
+            <w:tcW w:type="dxa" w:w="4320"/>
+            <w:shd w:val="clear" w:fill="1D4ED8"/>
+          </w:tcPr>
+          <w:p>
+            <w:r/>
+            <w:r>
+              <w:rPr>
+                <w:b/>
+                <w:color w:val="FFFFFF"/>
+                <w:sz w:val="18"/>
+              </w:rPr>
+              <w:t>Ponto</w:t>
+            </w:r>
+          </w:p>
+        </w:tc>
+        <w:tc>
+          <w:tcPr>
+            <w:tcW w:type="dxa" w:w="1440"/>
+            <w:shd w:val="clear" w:fill="1D4ED8"/>
+          </w:tcPr>
+          <w:p>
+            <w:r/>
+            <w:r>
+              <w:rPr>
+                <w:b/>
+                <w:color w:val="FFFFFF"/>
+                <w:sz w:val="18"/>
+              </w:rPr>
+              <w:t>Tipo</w:t>
+            </w:r>
+          </w:p>
+        </w:tc>
+        <w:tc>
+          <w:tcPr>
+            <w:tcW w:type="dxa" w:w="4320"/>
+            <w:shd w:val="clear" w:fill="1D4ED8"/>
+          </w:tcPr>
+          <w:p>
+            <w:r/>
+            <w:r>
+              <w:rPr>
+                <w:b/>
+                <w:color w:val="FFFFFF"/>
+                <w:sz w:val="18"/>
+              </w:rPr>
+              <w:t>Encaminhamento</w:t>
+            </w:r>
+          </w:p>
+        </w:tc>
+      </w:tr>
+      <w:tr>
+        <w:tc>
+          <w:tcPr>
+            <w:tcW w:type="dxa" w:w="4320"/>
+          </w:tcPr>
+          <w:p>
+            <w:r/>
+            <w:r>
+              <w:rPr>
+                <w:b w:val="0"/>
+                <w:sz w:val="18"/>
+              </w:rPr>
+              <w:t>Foco SF vs custom</w:t>
+            </w:r>
+          </w:p>
+        </w:tc>
+        <w:tc>
+          <w:tcPr>
+            <w:tcW w:type="dxa" w:w="1440"/>
+          </w:tcPr>
+          <w:p>
+            <w:r/>
+            <w:r>
+              <w:rPr>
+                <w:b w:val="0"/>
+                <w:sz w:val="18"/>
+              </w:rPr>
+              <w:t>Decisão</w:t>
+            </w:r>
+          </w:p>
+        </w:tc>
+        <w:tc>
+          <w:tcPr>
+            <w:tcW w:type="dxa" w:w="4320"/>
+            <w:shd w:val="clear" w:fill="DCFCE7"/>
+          </w:tcPr>
+          <w:p>
+            <w:r/>
+            <w:r>
+              <w:rPr>
+                <w:b w:val="0"/>
+                <w:color w:val="059669"/>
+                <w:sz w:val="18"/>
+              </w:rPr>
+              <w:t>✅ Decidido: foco Salesforce (stack também atende custom)</w:t>
+            </w:r>
+          </w:p>
+        </w:tc>
+      </w:tr>
+      <w:tr>
+        <w:tc>
+          <w:tcPr>
+            <w:tcW w:type="dxa" w:w="4320"/>
+          </w:tcPr>
+          <w:p>
+            <w:r/>
+            <w:r>
+              <w:rPr>
+                <w:b w:val="0"/>
+                <w:sz w:val="18"/>
+              </w:rPr>
+              <w:t>Engenheiro = pessoa ou agente</w:t>
+            </w:r>
+          </w:p>
+        </w:tc>
+        <w:tc>
+          <w:tcPr>
+            <w:tcW w:type="dxa" w:w="1440"/>
+          </w:tcPr>
+          <w:p>
+            <w:r/>
+            <w:r>
+              <w:rPr>
+                <w:b w:val="0"/>
+                <w:sz w:val="18"/>
+              </w:rPr>
+              <w:t>Decisão</w:t>
+            </w:r>
+          </w:p>
+        </w:tc>
+        <w:tc>
+          <w:tcPr>
+            <w:tcW w:type="dxa" w:w="4320"/>
+          </w:tcPr>
+          <w:p>
+            <w:r/>
+            <w:r>
+              <w:rPr>
+                <w:b w:val="0"/>
+                <w:sz w:val="18"/>
+              </w:rPr>
+              <w:t>Em aberto</w:t>
+            </w:r>
+          </w:p>
+        </w:tc>
+      </w:tr>
+      <w:tr>
+        <w:tc>
+          <w:tcPr>
+            <w:tcW w:type="dxa" w:w="4320"/>
+          </w:tcPr>
+          <w:p>
+            <w:r/>
+            <w:r>
+              <w:rPr>
+                <w:b w:val="0"/>
+                <w:sz w:val="18"/>
+              </w:rPr>
+              <w:t>Gates humanos (PR + verificação antes de Done)</w:t>
+            </w:r>
+          </w:p>
+        </w:tc>
+        <w:tc>
+          <w:tcPr>
+            <w:tcW w:type="dxa" w:w="1440"/>
+          </w:tcPr>
+          <w:p>
+            <w:r/>
+            <w:r>
+              <w:rPr>
+                <w:b w:val="0"/>
+                <w:sz w:val="18"/>
+              </w:rPr>
+              <w:t>Decisão</w:t>
+            </w:r>
+          </w:p>
+        </w:tc>
+        <w:tc>
+          <w:tcPr>
+            <w:tcW w:type="dxa" w:w="4320"/>
+          </w:tcPr>
+          <w:p>
+            <w:r/>
+            <w:r>
+              <w:rPr>
+                <w:b w:val="0"/>
+                <w:sz w:val="18"/>
+              </w:rPr>
+              <w:t>Em aberto</w:t>
+            </w:r>
+          </w:p>
+        </w:tc>
+      </w:tr>
+      <w:tr>
+        <w:tc>
+          <w:tcPr>
+            <w:tcW w:type="dxa" w:w="4320"/>
+          </w:tcPr>
+          <w:p>
+            <w:r/>
+            <w:r>
+              <w:rPr>
+                <w:b w:val="0"/>
+                <w:sz w:val="18"/>
+              </w:rPr>
+              <w:t>Context Loader sem spec</w:t>
+            </w:r>
+          </w:p>
+        </w:tc>
+        <w:tc>
+          <w:tcPr>
+            <w:tcW w:type="dxa" w:w="1440"/>
+          </w:tcPr>
+          <w:p>
+            <w:r/>
+            <w:r>
+              <w:rPr>
+                <w:b w:val="0"/>
+                <w:sz w:val="18"/>
+              </w:rPr>
+              <w:t>Gap</w:t>
+            </w:r>
+          </w:p>
+        </w:tc>
+        <w:tc>
+          <w:tcPr>
+            <w:tcW w:type="dxa" w:w="4320"/>
+          </w:tcPr>
+          <w:p>
+            <w:r/>
+            <w:r>
+              <w:rPr>
+                <w:b w:val="0"/>
+                <w:sz w:val="18"/>
+              </w:rPr>
+              <w:t>Construir spec — componente-chave</w:t>
+            </w:r>
+          </w:p>
+        </w:tc>
+      </w:tr>
+      <w:tr>
+        <w:tc>
+          <w:tcPr>
+            <w:tcW w:type="dxa" w:w="4320"/>
+          </w:tcPr>
+          <w:p>
+            <w:r/>
+            <w:r>
+              <w:rPr>
+                <w:b w:val="0"/>
+                <w:sz w:val="18"/>
+              </w:rPr>
+              <w:t>Catálogo de MCPs/Skills inexistente</w:t>
+            </w:r>
+          </w:p>
+        </w:tc>
+        <w:tc>
+          <w:tcPr>
+            <w:tcW w:type="dxa" w:w="1440"/>
+          </w:tcPr>
+          <w:p>
+            <w:r/>
+            <w:r>
+              <w:rPr>
+                <w:b w:val="0"/>
+                <w:sz w:val="18"/>
+              </w:rPr>
+              <w:t>Gap</w:t>
+            </w:r>
+          </w:p>
+        </w:tc>
+        <w:tc>
+          <w:tcPr>
+            <w:tcW w:type="dxa" w:w="4320"/>
+            <w:shd w:val="clear" w:fill="FEF3C7"/>
+          </w:tcPr>
+          <w:p>
+            <w:r/>
+            <w:r>
+              <w:rPr>
+                <w:b w:val="0"/>
+                <w:color w:val="B45309"/>
+                <w:sz w:val="18"/>
+              </w:rPr>
+              <w:t>Definir dono, versão, entradas/saídas</w:t>
+            </w:r>
+          </w:p>
+        </w:tc>
+      </w:tr>
+      <w:tr>
+        <w:tc>
+          <w:tcPr>
+            <w:tcW w:type="dxa" w:w="4320"/>
+          </w:tcPr>
+          <w:p>
+            <w:r/>
+            <w:r>
+              <w:rPr>
+                <w:b w:val="0"/>
+                <w:sz w:val="18"/>
+              </w:rPr>
+              <w:t>Qualidade/verificação do código gerado por IA</w:t>
+            </w:r>
+          </w:p>
+        </w:tc>
+        <w:tc>
+          <w:tcPr>
+            <w:tcW w:type="dxa" w:w="1440"/>
+          </w:tcPr>
+          <w:p>
+            <w:r/>
+            <w:r>
+              <w:rPr>
+                <w:b w:val="0"/>
+                <w:sz w:val="18"/>
+              </w:rPr>
+              <w:t>Gap</w:t>
+            </w:r>
+          </w:p>
+        </w:tc>
+        <w:tc>
+          <w:tcPr>
+            <w:tcW w:type="dxa" w:w="4320"/>
+            <w:shd w:val="clear" w:fill="FEF3C7"/>
+          </w:tcPr>
+          <w:p>
+            <w:r/>
+            <w:r>
+              <w:rPr>
+                <w:b w:val="0"/>
+                <w:color w:val="B45309"/>
+                <w:sz w:val="18"/>
+              </w:rPr>
+              <w:t>Definir testes + revisão + gate</w:t>
+            </w:r>
+          </w:p>
+        </w:tc>
+      </w:tr>
+      <w:tr>
+        <w:tc>
+          <w:tcPr>
+            <w:tcW w:type="dxa" w:w="4320"/>
+          </w:tcPr>
+          <w:p>
+            <w:r/>
+            <w:r>
+              <w:rPr>
+                <w:b w:val="0"/>
+                <w:sz w:val="18"/>
+              </w:rPr>
+              <w:t>DoR de contexto</w:t>
+            </w:r>
+          </w:p>
+        </w:tc>
+        <w:tc>
+          <w:tcPr>
+            <w:tcW w:type="dxa" w:w="1440"/>
+          </w:tcPr>
+          <w:p>
+            <w:r/>
+            <w:r>
+              <w:rPr>
+                <w:b w:val="0"/>
+                <w:sz w:val="18"/>
+              </w:rPr>
+              <w:t>Gap</w:t>
+            </w:r>
+          </w:p>
+        </w:tc>
+        <w:tc>
+          <w:tcPr>
+            <w:tcW w:type="dxa" w:w="4320"/>
+            <w:shd w:val="clear" w:fill="FEF3C7"/>
+          </w:tcPr>
+          <w:p>
+            <w:r/>
+            <w:r>
+              <w:rPr>
+                <w:b w:val="0"/>
+                <w:color w:val="B45309"/>
+                <w:sz w:val="18"/>
+              </w:rPr>
+              <w:t>Definir o que é 'context-ready'</w:t>
+            </w:r>
+          </w:p>
+        </w:tc>
+      </w:tr>
+      <w:tr>
+        <w:tc>
+          <w:tcPr>
+            <w:tcW w:type="dxa" w:w="4320"/>
+          </w:tcPr>
+          <w:p>
+            <w:r/>
+            <w:r>
+              <w:rPr>
+                <w:b w:val="0"/>
+                <w:sz w:val="18"/>
+              </w:rPr>
+              <w:t>Mapear ao ciclo F0–F5 (stack cobre F2–F4)</w:t>
+            </w:r>
+          </w:p>
+        </w:tc>
+        <w:tc>
+          <w:tcPr>
+            <w:tcW w:type="dxa" w:w="1440"/>
+          </w:tcPr>
+          <w:p>
+            <w:r/>
+            <w:r>
+              <w:rPr>
+                <w:b w:val="0"/>
+                <w:sz w:val="18"/>
+              </w:rPr>
+              <w:t>Gap</w:t>
+            </w:r>
+          </w:p>
+        </w:tc>
+        <w:tc>
+          <w:tcPr>
+            <w:tcW w:type="dxa" w:w="4320"/>
+            <w:shd w:val="clear" w:fill="FEF3C7"/>
+          </w:tcPr>
+          <w:p>
+            <w:r/>
+            <w:r>
+              <w:rPr>
+                <w:b w:val="0"/>
+                <w:color w:val="B45309"/>
+                <w:sz w:val="18"/>
+              </w:rPr>
+              <w:t>Definir F0/F1 e F5</w:t>
+            </w:r>
+          </w:p>
+        </w:tc>
+      </w:tr>
+      <w:tr>
+        <w:tc>
+          <w:tcPr>
+            <w:tcW w:type="dxa" w:w="4320"/>
+          </w:tcPr>
+          <w:p>
+            <w:r/>
+            <w:r>
+              <w:rPr>
+                <w:b w:val="0"/>
+                <w:sz w:val="18"/>
+              </w:rPr>
+              <w:t>Segurança/LGPD do contexto (dados no prompt)</w:t>
+            </w:r>
+          </w:p>
+        </w:tc>
+        <w:tc>
+          <w:tcPr>
+            <w:tcW w:type="dxa" w:w="1440"/>
+          </w:tcPr>
+          <w:p>
+            <w:r/>
+            <w:r>
+              <w:rPr>
+                <w:b w:val="0"/>
+                <w:sz w:val="18"/>
+              </w:rPr>
+              <w:t>Risco</w:t>
+            </w:r>
+          </w:p>
+        </w:tc>
+        <w:tc>
+          <w:tcPr>
+            <w:tcW w:type="dxa" w:w="4320"/>
+          </w:tcPr>
+          <w:p>
+            <w:r/>
+            <w:r>
+              <w:rPr>
+                <w:b w:val="0"/>
+                <w:sz w:val="18"/>
+              </w:rPr>
+              <w:t>Política de dados + anti prompt-injection</w:t>
+            </w:r>
+          </w:p>
+        </w:tc>
+      </w:tr>
+      <w:tr>
+        <w:tc>
+          <w:tcPr>
+            <w:tcW w:type="dxa" w:w="4320"/>
+          </w:tcPr>
+          <w:p>
+            <w:r/>
+            <w:r>
+              <w:rPr>
+                <w:b w:val="0"/>
+                <w:sz w:val="18"/>
+              </w:rPr>
+              <w:t>FinOps — custo por história</w:t>
+            </w:r>
+          </w:p>
+        </w:tc>
+        <w:tc>
+          <w:tcPr>
+            <w:tcW w:type="dxa" w:w="1440"/>
+          </w:tcPr>
+          <w:p>
+            <w:r/>
+            <w:r>
+              <w:rPr>
+                <w:b w:val="0"/>
+                <w:sz w:val="18"/>
+              </w:rPr>
+              <w:t>Risco</w:t>
+            </w:r>
+          </w:p>
+        </w:tc>
+        <w:tc>
+          <w:tcPr>
+            <w:tcW w:type="dxa" w:w="4320"/>
+          </w:tcPr>
+          <w:p>
+            <w:r/>
+            <w:r>
+              <w:rPr>
+                <w:b w:val="0"/>
+                <w:sz w:val="18"/>
+              </w:rPr>
+              <w:t>Modelo de custo + guardrails de consumo</w:t>
+            </w:r>
+          </w:p>
+        </w:tc>
+      </w:tr>
+      <w:tr>
+        <w:tc>
+          <w:tcPr>
+            <w:tcW w:type="dxa" w:w="4320"/>
+          </w:tcPr>
+          <w:p>
+            <w:r/>
+            <w:r>
+              <w:rPr>
+                <w:b w:val="0"/>
+                <w:sz w:val="18"/>
+              </w:rPr>
+              <w:t>Champion vira gargalo de escala</w:t>
+            </w:r>
+          </w:p>
+        </w:tc>
+        <w:tc>
+          <w:tcPr>
+            <w:tcW w:type="dxa" w:w="1440"/>
+          </w:tcPr>
+          <w:p>
+            <w:r/>
+            <w:r>
+              <w:rPr>
+                <w:b w:val="0"/>
+                <w:sz w:val="18"/>
+              </w:rPr>
+              <w:t>Risco</w:t>
+            </w:r>
+          </w:p>
+        </w:tc>
+        <w:tc>
+          <w:tcPr>
+            <w:tcW w:type="dxa" w:w="4320"/>
+            <w:shd w:val="clear" w:fill="FEF3C7"/>
+          </w:tcPr>
+          <w:p>
+            <w:r/>
+            <w:r>
+              <w:rPr>
+                <w:b w:val="0"/>
+                <w:color w:val="B45309"/>
+                <w:sz w:val="18"/>
+              </w:rPr>
+              <w:t>Definir escala do papel (1 por projeto?)</w:t>
+            </w:r>
+          </w:p>
+        </w:tc>
+      </w:tr>
+      <w:tr>
+        <w:tc>
+          <w:tcPr>
+            <w:tcW w:type="dxa" w:w="4320"/>
+          </w:tcPr>
+          <w:p>
+            <w:r/>
+            <w:r>
+              <w:rPr>
+                <w:b w:val="0"/>
+                <w:sz w:val="18"/>
+              </w:rPr>
+              <w:t>Métrica de volume incentiva o errado</w:t>
+            </w:r>
+          </w:p>
+        </w:tc>
+        <w:tc>
+          <w:tcPr>
+            <w:tcW w:type="dxa" w:w="1440"/>
+          </w:tcPr>
+          <w:p>
+            <w:r/>
+            <w:r>
+              <w:rPr>
+                <w:b w:val="0"/>
+                <w:sz w:val="18"/>
+              </w:rPr>
+              <w:t>Risco</w:t>
+            </w:r>
+          </w:p>
+        </w:tc>
+        <w:tc>
+          <w:tcPr>
+            <w:tcW w:type="dxa" w:w="4320"/>
+          </w:tcPr>
+          <w:p>
+            <w:r/>
+            <w:r>
+              <w:rPr>
+                <w:b w:val="0"/>
+                <w:sz w:val="18"/>
+              </w:rPr>
+              <w:t>Pesar desfecho (defeito/retrabalho)</w:t>
+            </w:r>
+          </w:p>
+        </w:tc>
+      </w:tr>
+    </w:tbl>
     <w:p>
       <w:r>
         <w:rPr>

</xml_diff>